<commit_message>
Updated the training books
</commit_message>
<xml_diff>
--- a/Questions.docx
+++ b/Questions.docx
@@ -19,6 +19,80 @@
       <w:r>
         <w:t>Will the evaluation allow image processing to be done, since our images are processed into RGB channels with a resolution of 512x512.</w:t>
       </w:r>
+    </w:p>
+    <w:p>
+      <w:pPr>
+        <w:pStyle w:val="ListParagraph"/>
+        <w:numPr>
+          <w:ilvl w:val="1"/>
+          <w:numId w:val="4"/>
+        </w:numPr>
+      </w:pPr>
+      <w:r>
+        <w:t>ok</w:t>
+      </w:r>
+    </w:p>
+    <w:p>
+      <w:pPr>
+        <w:pStyle w:val="ListParagraph"/>
+        <w:numPr>
+          <w:ilvl w:val="0"/>
+          <w:numId w:val="4"/>
+        </w:numPr>
+      </w:pPr>
+      <w:r>
+        <w:t>How many locations will be covered by the test set. How will we judged on locations our LoRA has not covered. Like how do you think our model should work, eg Img2img has a boundary. But what about our project? Is it endless? It will be unfair to just go across the campus and click photos for just the 3 of us</w:t>
+      </w:r>
+    </w:p>
+    <w:p>
+      <w:pPr>
+        <w:pStyle w:val="ListParagraph"/>
+        <w:numPr>
+          <w:ilvl w:val="1"/>
+          <w:numId w:val="4"/>
+        </w:numPr>
+      </w:pPr>
+      <w:r>
+        <w:t>Professor said the boundary of img 2 img</w:t>
+      </w:r>
+    </w:p>
+    <w:p>
+      <w:pPr>
+        <w:pStyle w:val="ListParagraph"/>
+        <w:numPr>
+          <w:ilvl w:val="0"/>
+          <w:numId w:val="4"/>
+        </w:numPr>
+      </w:pPr>
+      <w:r>
+        <w:t>When will the evaluation set be released. What kind of score is considered good? Is attempt towards a good score considered relevant? What about new buildings that the LoRA or any other model has never seen.</w:t>
+      </w:r>
+    </w:p>
+    <w:p>
+      <w:pPr>
+        <w:pStyle w:val="ListParagraph"/>
+        <w:numPr>
+          <w:ilvl w:val="1"/>
+          <w:numId w:val="4"/>
+        </w:numPr>
+      </w:pPr>
+      <w:r>
+        <w:t>Ask The TA</w:t>
+      </w:r>
+    </w:p>
+    <w:p>
+      <w:pPr>
+        <w:pStyle w:val="ListParagraph"/>
+        <w:numPr>
+          <w:ilvl w:val="0"/>
+          <w:numId w:val="4"/>
+        </w:numPr>
+      </w:pPr>
+      <w:bookmarkStart w:id="0" w:name="OLE_LINK2"/>
+      <w:r>
+        <w:t>If the location is not bounded then we should be using instructpix2pix as our base.</w:t>
+      </w:r>
+      <w:bookmarkEnd w:id="0"/>
     </w:p>
     <w:sectPr>
       <w:pgSz w:w="12240" w:h="15840"/>
@@ -198,7 +272,7 @@
         <w:rFonts w:hint="default"/>
       </w:rPr>
     </w:lvl>
-    <w:lvl w:ilvl="1" w:tplc="04090019" w:tentative="1">
+    <w:lvl w:ilvl="1" w:tplc="04090019">
       <w:start w:val="1"/>
       <w:numFmt w:val="lowerLetter"/>
       <w:lvlText w:val="%2."/>

</xml_diff>